<commit_message>
modificación en individuales 1.1, 1.2 y se agregar grupales 1.4 y 15
</commit_message>
<xml_diff>
--- a/Fase 1/Evidencias Individuales/Olguea_Fernando_1.1_APT122_AutoevaluacionCompetenciasFase1.docx
+++ b/Fase 1/Evidencias Individuales/Olguea_Fernando_1.1_APT122_AutoevaluacionCompetenciasFase1.docx
@@ -851,6 +851,15 @@
                 <w:szCs w:val="24"/>
               </w:rPr>
             </w:pPr>
+            <w:r>
+              <w:rPr>
+                <w:rFonts w:eastAsiaTheme="majorEastAsia"/>
+                <w:color w:val="767171" w:themeColor="background2" w:themeShade="80"/>
+                <w:sz w:val="24"/>
+                <w:szCs w:val="24"/>
+              </w:rPr>
+              <w:t>Fernando Patricio Olguea González</w:t>
+            </w:r>
           </w:p>
         </w:tc>
       </w:tr>
@@ -903,6 +912,15 @@
                 <w:szCs w:val="24"/>
               </w:rPr>
             </w:pPr>
+            <w:r>
+              <w:rPr>
+                <w:rFonts w:eastAsiaTheme="majorEastAsia"/>
+                <w:color w:val="767171" w:themeColor="background2" w:themeShade="80"/>
+                <w:sz w:val="24"/>
+                <w:szCs w:val="24"/>
+              </w:rPr>
+              <w:t>Ingeniería en Informática</w:t>
+            </w:r>
           </w:p>
         </w:tc>
       </w:tr>
@@ -958,6 +976,15 @@
                 <w:szCs w:val="24"/>
               </w:rPr>
             </w:pPr>
+            <w:r>
+              <w:rPr>
+                <w:rFonts w:eastAsiaTheme="majorEastAsia"/>
+                <w:color w:val="767171" w:themeColor="background2" w:themeShade="80"/>
+                <w:sz w:val="24"/>
+                <w:szCs w:val="24"/>
+              </w:rPr>
+              <w:t>2023</w:t>
+            </w:r>
           </w:p>
         </w:tc>
       </w:tr>
@@ -1287,13 +1314,19 @@
             <w:pPr>
               <w:jc w:val="center"/>
               <w:rPr>
-                <w:b/>
-                <w:bCs/>
                 <w:color w:val="FF0000"/>
                 <w:sz w:val="18"/>
                 <w:szCs w:val="18"/>
               </w:rPr>
             </w:pPr>
+            <w:r>
+              <w:rPr>
+                <w:color w:val="000000" w:themeColor="text1"/>
+                <w:sz w:val="18"/>
+                <w:szCs w:val="18"/>
+              </w:rPr>
+              <w:t>Ofrecer propuestas de solución informática analizando de forma integral los procesos de acuerdo con los requerimientos de la organización.</w:t>
+            </w:r>
           </w:p>
         </w:tc>
         <w:tc>
@@ -1320,12 +1353,17 @@
             <w:pPr>
               <w:jc w:val="center"/>
               <w:rPr>
-                <w:b/>
-                <w:bCs/>
                 <w:sz w:val="18"/>
                 <w:szCs w:val="18"/>
               </w:rPr>
             </w:pPr>
+            <w:r>
+              <w:rPr>
+                <w:sz w:val="18"/>
+                <w:szCs w:val="18"/>
+              </w:rPr>
+              <w:t>Alto Dominio (AD)</w:t>
+            </w:r>
           </w:p>
         </w:tc>
         <w:tc>
@@ -1384,12 +1422,17 @@
             <w:pPr>
               <w:jc w:val="center"/>
               <w:rPr>
-                <w:b/>
-                <w:bCs/>
                 <w:sz w:val="18"/>
                 <w:szCs w:val="18"/>
               </w:rPr>
             </w:pPr>
+            <w:r>
+              <w:rPr>
+                <w:sz w:val="18"/>
+                <w:szCs w:val="18"/>
+              </w:rPr>
+              <w:t>He desarrollado experiencia analizando necesidades de usuarios y organizaciones, levantando requerimientos y proponiendo soluciones tecnológicas aplicadas a contextos reales. Considero que poseo un buen dominio de esta competencia, aunque debo continuar fortaleciendo la formalización y trazabilidad de requerimientos en proyectos de mayor complejidad.</w:t>
+            </w:r>
           </w:p>
         </w:tc>
       </w:tr>
@@ -1406,13 +1449,19 @@
             <w:pPr>
               <w:jc w:val="center"/>
               <w:rPr>
-                <w:b/>
-                <w:bCs/>
                 <w:color w:val="FF0000"/>
                 <w:sz w:val="18"/>
                 <w:szCs w:val="18"/>
               </w:rPr>
             </w:pPr>
+            <w:r>
+              <w:rPr>
+                <w:color w:val="000000" w:themeColor="text1"/>
+                <w:sz w:val="18"/>
+                <w:szCs w:val="18"/>
+              </w:rPr>
+              <w:t>Desarrollar una solución de software utilizando técnicas que permitan sistematizar el proceso de desarrollo y mantenimiento, asegurando el logro de los objetivos.</w:t>
+            </w:r>
           </w:p>
         </w:tc>
         <w:tc>
@@ -1439,12 +1488,17 @@
             <w:pPr>
               <w:jc w:val="center"/>
               <w:rPr>
-                <w:b/>
-                <w:bCs/>
                 <w:sz w:val="18"/>
                 <w:szCs w:val="18"/>
               </w:rPr>
             </w:pPr>
+            <w:r>
+              <w:rPr>
+                <w:sz w:val="18"/>
+                <w:szCs w:val="18"/>
+              </w:rPr>
+              <w:t>Alto Dominio (AD)</w:t>
+            </w:r>
           </w:p>
         </w:tc>
         <w:tc>
@@ -1503,12 +1557,17 @@
             <w:pPr>
               <w:jc w:val="center"/>
               <w:rPr>
-                <w:b/>
-                <w:bCs/>
                 <w:sz w:val="18"/>
                 <w:szCs w:val="18"/>
               </w:rPr>
             </w:pPr>
+            <w:r>
+              <w:rPr>
+                <w:sz w:val="18"/>
+                <w:szCs w:val="18"/>
+              </w:rPr>
+              <w:t>He participado en el desarrollo y evolución de aplicaciones y sistemas utilizando metodologías, control de versiones, pruebas e integración de distintos componentes. Me siento seguro en el desarrollo de software, aunque debo seguir profundizando en procesos de ingeniería y aseguramiento sistemático de la mantenibilidad.</w:t>
+            </w:r>
           </w:p>
         </w:tc>
       </w:tr>
@@ -1525,12 +1584,17 @@
             <w:pPr>
               <w:jc w:val="center"/>
               <w:rPr>
-                <w:b/>
-                <w:bCs/>
                 <w:sz w:val="18"/>
                 <w:szCs w:val="18"/>
               </w:rPr>
             </w:pPr>
+            <w:r>
+              <w:rPr>
+                <w:sz w:val="18"/>
+                <w:szCs w:val="18"/>
+              </w:rPr>
+              <w:t>Construir modelos de datos para soportar los requerimientos de la organización de acuerdo con un diseño definido y escalable en el tiempo.</w:t>
+            </w:r>
           </w:p>
         </w:tc>
         <w:tc>
@@ -1557,6 +1621,140 @@
             <w:pPr>
               <w:jc w:val="center"/>
               <w:rPr>
+                <w:sz w:val="18"/>
+                <w:szCs w:val="18"/>
+              </w:rPr>
+            </w:pPr>
+            <w:r>
+              <w:rPr>
+                <w:sz w:val="18"/>
+                <w:szCs w:val="18"/>
+              </w:rPr>
+              <w:t>Alto Dominio (AD)</w:t>
+            </w:r>
+          </w:p>
+        </w:tc>
+        <w:tc>
+          <w:tcPr>
+            <w:tcW w:w="1055" w:type="dxa"/>
+          </w:tcPr>
+          <w:p>
+            <w:pPr>
+              <w:jc w:val="center"/>
+              <w:rPr>
+                <w:b/>
+                <w:bCs/>
+                <w:sz w:val="18"/>
+                <w:szCs w:val="18"/>
+              </w:rPr>
+            </w:pPr>
+          </w:p>
+        </w:tc>
+        <w:tc>
+          <w:tcPr>
+            <w:tcW w:w="1187" w:type="dxa"/>
+          </w:tcPr>
+          <w:p>
+            <w:pPr>
+              <w:jc w:val="center"/>
+              <w:rPr>
+                <w:b/>
+                <w:bCs/>
+                <w:sz w:val="18"/>
+                <w:szCs w:val="18"/>
+              </w:rPr>
+            </w:pPr>
+          </w:p>
+        </w:tc>
+        <w:tc>
+          <w:tcPr>
+            <w:tcW w:w="1250" w:type="dxa"/>
+          </w:tcPr>
+          <w:p>
+            <w:pPr>
+              <w:jc w:val="center"/>
+              <w:rPr>
+                <w:b/>
+                <w:bCs/>
+                <w:sz w:val="18"/>
+                <w:szCs w:val="18"/>
+              </w:rPr>
+            </w:pPr>
+          </w:p>
+        </w:tc>
+        <w:tc>
+          <w:tcPr>
+            <w:tcW w:w="2557" w:type="dxa"/>
+          </w:tcPr>
+          <w:p>
+            <w:pPr>
+              <w:jc w:val="center"/>
+              <w:rPr>
+                <w:sz w:val="18"/>
+                <w:szCs w:val="18"/>
+              </w:rPr>
+            </w:pPr>
+            <w:r>
+              <w:rPr>
+                <w:sz w:val="18"/>
+                <w:szCs w:val="18"/>
+              </w:rPr>
+              <w:t>He trabajado en diseño y estructuración de bases de datos para aplicaciones y sistemas, definiendo entidades, relaciones y modelos orientados a requerimientos. Aun así, considero necesario seguir fortaleciendo el diseño para escenarios de alta escala y arquitecturas de datos más complejas.</w:t>
+            </w:r>
+          </w:p>
+        </w:tc>
+      </w:tr>
+      <w:tr>
+        <w:trPr>
+          <w:trHeight w:val="2053"/>
+          <w:jc w:val="center"/>
+        </w:trPr>
+        <w:tc>
+          <w:tcPr>
+            <w:tcW w:w="1931" w:type="dxa"/>
+          </w:tcPr>
+          <w:p>
+            <w:pPr>
+              <w:jc w:val="center"/>
+              <w:rPr>
+                <w:sz w:val="18"/>
+                <w:szCs w:val="18"/>
+              </w:rPr>
+            </w:pPr>
+            <w:r>
+              <w:rPr>
+                <w:sz w:val="18"/>
+                <w:szCs w:val="18"/>
+              </w:rPr>
+              <w:lastRenderedPageBreak/>
+              <w:t>Realizar pruebas de certificación tanto de los productos como de los procesos utilizando buenas prácticas definidas por la industria.</w:t>
+            </w:r>
+          </w:p>
+        </w:tc>
+        <w:tc>
+          <w:tcPr>
+            <w:tcW w:w="1017" w:type="dxa"/>
+          </w:tcPr>
+          <w:p>
+            <w:pPr>
+              <w:jc w:val="center"/>
+              <w:rPr>
+                <w:b/>
+                <w:bCs/>
+                <w:sz w:val="18"/>
+                <w:szCs w:val="18"/>
+              </w:rPr>
+            </w:pPr>
+          </w:p>
+        </w:tc>
+        <w:tc>
+          <w:tcPr>
+            <w:tcW w:w="926" w:type="dxa"/>
+          </w:tcPr>
+          <w:p>
+            <w:pPr>
+              <w:jc w:val="center"/>
+              <w:rPr>
                 <w:b/>
                 <w:bCs/>
                 <w:sz w:val="18"/>
@@ -1573,12 +1771,17 @@
             <w:pPr>
               <w:jc w:val="center"/>
               <w:rPr>
-                <w:b/>
-                <w:bCs/>
                 <w:sz w:val="18"/>
                 <w:szCs w:val="18"/>
               </w:rPr>
             </w:pPr>
+            <w:r>
+              <w:rPr>
+                <w:sz w:val="18"/>
+                <w:szCs w:val="18"/>
+              </w:rPr>
+              <w:t>Dominio Aceptable (DA)</w:t>
+            </w:r>
           </w:p>
         </w:tc>
         <w:tc>
@@ -1621,12 +1824,17 @@
             <w:pPr>
               <w:jc w:val="center"/>
               <w:rPr>
-                <w:b/>
-                <w:bCs/>
                 <w:sz w:val="18"/>
                 <w:szCs w:val="18"/>
               </w:rPr>
             </w:pPr>
+            <w:r>
+              <w:rPr>
+                <w:sz w:val="18"/>
+                <w:szCs w:val="18"/>
+              </w:rPr>
+              <w:t>He realizado pruebas funcionales, de integración y validaciones de soluciones desarrolladas, pero todavía necesito profundizar en automatización de pruebas, estrategias formales de QA, cobertura y certificación sistemática de calidad.</w:t>
+            </w:r>
           </w:p>
         </w:tc>
       </w:tr>
@@ -1643,12 +1851,33 @@
             <w:pPr>
               <w:jc w:val="center"/>
               <w:rPr>
-                <w:b/>
-                <w:bCs/>
                 <w:sz w:val="18"/>
                 <w:szCs w:val="18"/>
               </w:rPr>
             </w:pPr>
+            <w:r>
+              <w:rPr>
+                <w:sz w:val="18"/>
+                <w:szCs w:val="18"/>
+              </w:rPr>
+              <w:t xml:space="preserve">Construir el modelo arquitectónico de una solución sistémica que soporte los procesos de negocio </w:t>
+            </w:r>
+            <w:proofErr w:type="gramStart"/>
+            <w:r>
+              <w:rPr>
+                <w:sz w:val="18"/>
+                <w:szCs w:val="18"/>
+              </w:rPr>
+              <w:t>de acuerdo a</w:t>
+            </w:r>
+            <w:proofErr w:type="gramEnd"/>
+            <w:r>
+              <w:rPr>
+                <w:sz w:val="18"/>
+                <w:szCs w:val="18"/>
+              </w:rPr>
+              <w:t xml:space="preserve"> los requerimientos de la organización y estándares industria.</w:t>
+            </w:r>
           </w:p>
         </w:tc>
         <w:tc>
@@ -1675,12 +1904,17 @@
             <w:pPr>
               <w:jc w:val="center"/>
               <w:rPr>
-                <w:b/>
-                <w:bCs/>
                 <w:sz w:val="18"/>
                 <w:szCs w:val="18"/>
               </w:rPr>
             </w:pPr>
+            <w:r>
+              <w:rPr>
+                <w:sz w:val="18"/>
+                <w:szCs w:val="18"/>
+              </w:rPr>
+              <w:t>Alto Dominio (AD)</w:t>
+            </w:r>
           </w:p>
         </w:tc>
         <w:tc>
@@ -1739,130 +1973,33 @@
             <w:pPr>
               <w:jc w:val="center"/>
               <w:rPr>
-                <w:b/>
-                <w:bCs/>
                 <w:sz w:val="18"/>
                 <w:szCs w:val="18"/>
               </w:rPr>
             </w:pPr>
-          </w:p>
-        </w:tc>
-      </w:tr>
-      <w:tr>
-        <w:trPr>
-          <w:trHeight w:val="591"/>
-          <w:jc w:val="center"/>
-        </w:trPr>
-        <w:tc>
-          <w:tcPr>
-            <w:tcW w:w="1931" w:type="dxa"/>
-          </w:tcPr>
-          <w:p>
-            <w:pPr>
-              <w:jc w:val="center"/>
-              <w:rPr>
-                <w:b/>
-                <w:bCs/>
+            <w:r>
+              <w:rPr>
                 <w:sz w:val="18"/>
                 <w:szCs w:val="18"/>
               </w:rPr>
-            </w:pPr>
-          </w:p>
-        </w:tc>
-        <w:tc>
-          <w:tcPr>
-            <w:tcW w:w="1017" w:type="dxa"/>
-          </w:tcPr>
-          <w:p>
-            <w:pPr>
-              <w:jc w:val="center"/>
-              <w:rPr>
-                <w:b/>
-                <w:bCs/>
+              <w:t xml:space="preserve">He participado en el diseño de arquitecturas de aplicaciones, </w:t>
+            </w:r>
+            <w:proofErr w:type="spellStart"/>
+            <w:r>
+              <w:rPr>
                 <w:sz w:val="18"/>
                 <w:szCs w:val="18"/>
               </w:rPr>
-            </w:pPr>
-          </w:p>
-        </w:tc>
-        <w:tc>
-          <w:tcPr>
-            <w:tcW w:w="926" w:type="dxa"/>
-          </w:tcPr>
-          <w:p>
-            <w:pPr>
-              <w:jc w:val="center"/>
-              <w:rPr>
-                <w:b/>
-                <w:bCs/>
+              <w:t>APIs</w:t>
+            </w:r>
+            <w:proofErr w:type="spellEnd"/>
+            <w:r>
+              <w:rPr>
                 <w:sz w:val="18"/>
                 <w:szCs w:val="18"/>
               </w:rPr>
-            </w:pPr>
-          </w:p>
-        </w:tc>
-        <w:tc>
-          <w:tcPr>
-            <w:tcW w:w="1055" w:type="dxa"/>
-          </w:tcPr>
-          <w:p>
-            <w:pPr>
-              <w:jc w:val="center"/>
-              <w:rPr>
-                <w:b/>
-                <w:bCs/>
-                <w:sz w:val="18"/>
-                <w:szCs w:val="18"/>
-              </w:rPr>
-            </w:pPr>
-          </w:p>
-        </w:tc>
-        <w:tc>
-          <w:tcPr>
-            <w:tcW w:w="1187" w:type="dxa"/>
-          </w:tcPr>
-          <w:p>
-            <w:pPr>
-              <w:jc w:val="center"/>
-              <w:rPr>
-                <w:b/>
-                <w:bCs/>
-                <w:sz w:val="18"/>
-                <w:szCs w:val="18"/>
-              </w:rPr>
-            </w:pPr>
-          </w:p>
-        </w:tc>
-        <w:tc>
-          <w:tcPr>
-            <w:tcW w:w="1250" w:type="dxa"/>
-          </w:tcPr>
-          <w:p>
-            <w:pPr>
-              <w:jc w:val="center"/>
-              <w:rPr>
-                <w:b/>
-                <w:bCs/>
-                <w:sz w:val="18"/>
-                <w:szCs w:val="18"/>
-              </w:rPr>
-            </w:pPr>
-          </w:p>
-        </w:tc>
-        <w:tc>
-          <w:tcPr>
-            <w:tcW w:w="2557" w:type="dxa"/>
-          </w:tcPr>
-          <w:p>
-            <w:pPr>
-              <w:jc w:val="center"/>
-              <w:rPr>
-                <w:b/>
-                <w:bCs/>
-                <w:sz w:val="18"/>
-                <w:szCs w:val="18"/>
-              </w:rPr>
-            </w:pPr>
+              <w:t>, integraciones, bases de datos e infraestructura asociada a sistemas. Tengo experiencia práctica en esta área, aunque debo continuar fortaleciendo la documentación arquitectónica formal y la evaluación comparativa de decisiones mediante estándares de la industria.</w:t>
+            </w:r>
           </w:p>
         </w:tc>
       </w:tr>
@@ -1879,12 +2016,33 @@
             <w:pPr>
               <w:jc w:val="center"/>
               <w:rPr>
-                <w:b/>
-                <w:bCs/>
                 <w:sz w:val="18"/>
                 <w:szCs w:val="18"/>
               </w:rPr>
             </w:pPr>
+            <w:r>
+              <w:rPr>
+                <w:sz w:val="18"/>
+                <w:szCs w:val="18"/>
+              </w:rPr>
+              <w:t xml:space="preserve">Implementar soluciones sistémicas integrales para automatizar u optimizar procesos de negocio </w:t>
+            </w:r>
+            <w:proofErr w:type="gramStart"/>
+            <w:r>
+              <w:rPr>
+                <w:sz w:val="18"/>
+                <w:szCs w:val="18"/>
+              </w:rPr>
+              <w:t>de acuerdo a</w:t>
+            </w:r>
+            <w:proofErr w:type="gramEnd"/>
+            <w:r>
+              <w:rPr>
+                <w:sz w:val="18"/>
+                <w:szCs w:val="18"/>
+              </w:rPr>
+              <w:t xml:space="preserve"> las necesidades de la organización.</w:t>
+            </w:r>
           </w:p>
         </w:tc>
         <w:tc>
@@ -1911,12 +2069,17 @@
             <w:pPr>
               <w:jc w:val="center"/>
               <w:rPr>
-                <w:b/>
-                <w:bCs/>
                 <w:sz w:val="18"/>
                 <w:szCs w:val="18"/>
               </w:rPr>
             </w:pPr>
+            <w:r>
+              <w:rPr>
+                <w:sz w:val="18"/>
+                <w:szCs w:val="18"/>
+              </w:rPr>
+              <w:t>Alto Dominio (AD)</w:t>
+            </w:r>
           </w:p>
         </w:tc>
         <w:tc>
@@ -1975,130 +2138,17 @@
             <w:pPr>
               <w:jc w:val="center"/>
               <w:rPr>
-                <w:b/>
-                <w:bCs/>
                 <w:sz w:val="18"/>
                 <w:szCs w:val="18"/>
               </w:rPr>
             </w:pPr>
-          </w:p>
-        </w:tc>
-      </w:tr>
-      <w:tr>
-        <w:trPr>
-          <w:trHeight w:val="591"/>
-          <w:jc w:val="center"/>
-        </w:trPr>
-        <w:tc>
-          <w:tcPr>
-            <w:tcW w:w="1931" w:type="dxa"/>
-          </w:tcPr>
-          <w:p>
-            <w:pPr>
-              <w:jc w:val="center"/>
-              <w:rPr>
-                <w:b/>
-                <w:bCs/>
+            <w:r>
+              <w:rPr>
                 <w:sz w:val="18"/>
                 <w:szCs w:val="18"/>
               </w:rPr>
-            </w:pPr>
-          </w:p>
-        </w:tc>
-        <w:tc>
-          <w:tcPr>
-            <w:tcW w:w="1017" w:type="dxa"/>
-          </w:tcPr>
-          <w:p>
-            <w:pPr>
-              <w:jc w:val="center"/>
-              <w:rPr>
-                <w:b/>
-                <w:bCs/>
-                <w:sz w:val="18"/>
-                <w:szCs w:val="18"/>
-              </w:rPr>
-            </w:pPr>
-          </w:p>
-        </w:tc>
-        <w:tc>
-          <w:tcPr>
-            <w:tcW w:w="926" w:type="dxa"/>
-          </w:tcPr>
-          <w:p>
-            <w:pPr>
-              <w:jc w:val="center"/>
-              <w:rPr>
-                <w:b/>
-                <w:bCs/>
-                <w:sz w:val="18"/>
-                <w:szCs w:val="18"/>
-              </w:rPr>
-            </w:pPr>
-          </w:p>
-        </w:tc>
-        <w:tc>
-          <w:tcPr>
-            <w:tcW w:w="1055" w:type="dxa"/>
-          </w:tcPr>
-          <w:p>
-            <w:pPr>
-              <w:jc w:val="center"/>
-              <w:rPr>
-                <w:b/>
-                <w:bCs/>
-                <w:sz w:val="18"/>
-                <w:szCs w:val="18"/>
-              </w:rPr>
-            </w:pPr>
-          </w:p>
-        </w:tc>
-        <w:tc>
-          <w:tcPr>
-            <w:tcW w:w="1187" w:type="dxa"/>
-          </w:tcPr>
-          <w:p>
-            <w:pPr>
-              <w:jc w:val="center"/>
-              <w:rPr>
-                <w:b/>
-                <w:bCs/>
-                <w:sz w:val="18"/>
-                <w:szCs w:val="18"/>
-              </w:rPr>
-            </w:pPr>
-          </w:p>
-        </w:tc>
-        <w:tc>
-          <w:tcPr>
-            <w:tcW w:w="1250" w:type="dxa"/>
-          </w:tcPr>
-          <w:p>
-            <w:pPr>
-              <w:jc w:val="center"/>
-              <w:rPr>
-                <w:b/>
-                <w:bCs/>
-                <w:sz w:val="18"/>
-                <w:szCs w:val="18"/>
-              </w:rPr>
-            </w:pPr>
-          </w:p>
-        </w:tc>
-        <w:tc>
-          <w:tcPr>
-            <w:tcW w:w="2557" w:type="dxa"/>
-          </w:tcPr>
-          <w:p>
-            <w:pPr>
-              <w:jc w:val="center"/>
-              <w:rPr>
-                <w:b/>
-                <w:bCs/>
-                <w:sz w:val="18"/>
-                <w:szCs w:val="18"/>
-              </w:rPr>
-            </w:pPr>
+              <w:t>He implementado soluciones que integran aplicaciones, servicios, bases de datos y automatización para resolver necesidades operacionales reales. Considero que es una de mis fortalezas, aunque aún puedo mejorar en implantaciones de mayor escala, observabilidad y gestión estructurada del cambio.</w:t>
+            </w:r>
           </w:p>
         </w:tc>
       </w:tr>
@@ -2115,12 +2165,31 @@
             <w:pPr>
               <w:jc w:val="center"/>
               <w:rPr>
-                <w:b/>
-                <w:bCs/>
                 <w:sz w:val="18"/>
                 <w:szCs w:val="18"/>
               </w:rPr>
             </w:pPr>
+            <w:r>
+              <w:rPr>
+                <w:sz w:val="18"/>
+                <w:szCs w:val="18"/>
+              </w:rPr>
+              <w:t xml:space="preserve">Gestionar proyectos informáticos, ofreciendo alternativas para la toma de decisiones </w:t>
+            </w:r>
+            <w:r>
+              <w:rPr>
+                <w:sz w:val="18"/>
+                <w:szCs w:val="18"/>
+              </w:rPr>
+              <w:t>de acuerdo con</w:t>
+            </w:r>
+            <w:r>
+              <w:rPr>
+                <w:sz w:val="18"/>
+                <w:szCs w:val="18"/>
+              </w:rPr>
+              <w:t xml:space="preserve"> los requerimientos de la organización.</w:t>
+            </w:r>
           </w:p>
         </w:tc>
         <w:tc>
@@ -2147,12 +2216,17 @@
             <w:pPr>
               <w:jc w:val="center"/>
               <w:rPr>
-                <w:b/>
-                <w:bCs/>
                 <w:sz w:val="18"/>
                 <w:szCs w:val="18"/>
               </w:rPr>
             </w:pPr>
+            <w:r>
+              <w:rPr>
+                <w:sz w:val="18"/>
+                <w:szCs w:val="18"/>
+              </w:rPr>
+              <w:t>Alto Dominio (AD)</w:t>
+            </w:r>
           </w:p>
         </w:tc>
         <w:tc>
@@ -2211,12 +2285,17 @@
             <w:pPr>
               <w:jc w:val="center"/>
               <w:rPr>
-                <w:b/>
-                <w:bCs/>
                 <w:sz w:val="18"/>
                 <w:szCs w:val="18"/>
               </w:rPr>
             </w:pPr>
+            <w:r>
+              <w:rPr>
+                <w:sz w:val="18"/>
+                <w:szCs w:val="18"/>
+              </w:rPr>
+              <w:t>He participado en planificación, priorización, seguimiento y toma de decisiones en proyectos tecnológicos, coordinando desarrollo e implementación. Sin embargo, debo continuar fortaleciendo la aplicación formal de metodologías, gestión de riesgos, estimaciones y métricas de seguimiento de proyectos.</w:t>
+            </w:r>
           </w:p>
         </w:tc>
       </w:tr>

</xml_diff>